<commit_message>
docs(pitch): integrate YouTube walkthrough link (https://youtu.be/4z2y129paOY)
Embeds the unlisted YouTube link of the 5:47 walkthrough into:
- pitch/PITCH_DECK.md slide 5 (replacing the [YouTube unlisted link] placeholder)
- pitch/EMAIL_TEMPLATE.md template #1 (link below the attached pitch deck mention)
- pitch/TWITTER_THREAD.md tweet 10 (call-to-action with walkthrough link)

Plus regenerated all 26 PDF/DOCX exports so the artifacts attached to the
Sky Mavis email already include the link without needing to re-encode at
send time.

Video stays UNLISTED on YouTube — only accessible via direct link, not
indexed in search, not visible on the channel until Sky Mavis approves
public release.

Co-Authored-By: Claude Opus 4.7 (1M context) <noreply@anthropic.com>
</commit_message>
<xml_diff>
--- a/pitch/exports/pitch-EMAIL_TEMPLATE.docx
+++ b/pitch/exports/pitch-EMAIL_TEMPLATE.docx
@@ -439,7 +439,16 @@
         <w:rPr>
           <w:rStyle w:val="VerbatimChar"/>
         </w:rPr>
-        <w:t xml:space="preserve">Attached: pitch deck (PDF). 5-min YouTube walkthrough available on request.</w:t>
+        <w:t xml:space="preserve">Attached: pitch deck (PDF).</w:t>
+      </w:r>
+      <w:r>
+        <w:br/>
+      </w:r>
+      <w:r>
+        <w:rPr>
+          <w:rStyle w:val="VerbatimChar"/>
+        </w:rPr>
+        <w:t xml:space="preserve">5-min YouTube walkthrough: https://youtu.be/4z2y129paOY (unlisted)</w:t>
       </w:r>
       <w:r>
         <w:br/>

</xml_diff>